<commit_message>
Adiciona ilustrações, slide e quiz do Kahoot à aula de Redes (EJA)
Parte da versão revisada pelo professor; ilustrações Fluent Emoji (MIT).

Co-Authored-By: Claude Opus 5.5 <noreply@anthropic.com>
Claude-Session: https://claude.ai/code/session_01FwqaHkVbAJG16jSYb6wSMT
</commit_message>
<xml_diff>
--- a/aulas/eja-redes/Plano_de_Aula_Redes_EJA.docx
+++ b/aulas/eja-redes/Plano_de_Aula_Redes_EJA.docx
@@ -457,7 +457,7 @@
                 <w:sz w:val="21"/>
                 <w:szCs w:val="21"/>
               </w:rPr>
-              <w:t xml:space="preserve">3 períodos (≈ 135 min) — ou 2 encontros</w:t>
+              <w:t xml:space="preserve">3 a 4 períodos (≈ 150 min com o Kahoot) — ou 2 encontros</w:t>
             </w:r>
           </w:p>
         </w:tc>
@@ -904,7 +904,26 @@
           <w:sz w:val="23"/>
           <w:szCs w:val="23"/>
         </w:rPr>
-        <w:t xml:space="preserve">Projetor e apresentação "Redes_de_Computadores_EJA.pptx" (29 slides, com roteiro nas anotações)</w:t>
+        <w:t xml:space="preserve">Projetor e apresentação "Aula_021_Redes_de_Computadores_EJA.pptx" (30 slides, com roteiro nas anotações)</w:t>
+      </w:r>
+    </w:p>
+    <w:p>
+      <w:pPr>
+        <w:pStyle w:val="ListParagraph"/>
+        <w:numPr>
+          <w:ilvl w:val="0"/>
+          <w:numId w:val="2"/>
+        </w:numPr>
+        <w:spacing w:after="60" w:line="276"/>
+      </w:pPr>
+      <w:r>
+        <w:rPr>
+          <w:rFonts w:ascii="Calibri" w:cs="Calibri" w:eastAsia="Calibri" w:hAnsi="Calibri"/>
+          <w:color w:val="232323"/>
+          <w:sz w:val="23"/>
+          <w:szCs w:val="23"/>
+        </w:rPr>
+        <w:t xml:space="preserve">Quiz no Kahoot: planilha "Kahoot_Redes_EJA.xlsx" com 22 perguntas, para importar no Kahoot antes da aula</w:t>
       </w:r>
     </w:p>
     <w:p>
@@ -2038,7 +2057,7 @@
                 <w:sz w:val="21"/>
                 <w:szCs w:val="21"/>
               </w:rPr>
-              <w:t xml:space="preserve">Fechamento</w:t>
+              <w:t xml:space="preserve">Revisão</w:t>
             </w:r>
           </w:p>
         </w:tc>
@@ -2067,7 +2086,7 @@
                 <w:sz w:val="21"/>
                 <w:szCs w:val="21"/>
               </w:rPr>
-              <w:t xml:space="preserve">28–29</w:t>
+              <w:t xml:space="preserve">28</w:t>
             </w:r>
           </w:p>
         </w:tc>
@@ -2096,7 +2115,247 @@
                 <w:sz w:val="21"/>
                 <w:szCs w:val="21"/>
               </w:rPr>
-              <w:t xml:space="preserve">Revisão oral (cada um diz algo que aprendeu) e tarefa para casa.</w:t>
+              <w:t xml:space="preserve">Revisão oral: cada um diz algo que aprendeu.</w:t>
+            </w:r>
+          </w:p>
+        </w:tc>
+      </w:tr>
+      <w:tr>
+        <w:trPr>
+          <w:cantSplit/>
+          <w:tblHeader w:val="false"/>
+        </w:trPr>
+        <w:tc>
+          <w:tcPr>
+            <w:tcW w:type="dxa" w:w="1000"/>
+            <w:tcMar>
+              <w:top w:type="dxa" w:w="70"/>
+              <w:left w:type="dxa" w:w="110"/>
+              <w:bottom w:type="dxa" w:w="70"/>
+              <w:right w:type="dxa" w:w="110"/>
+            </w:tcMar>
+            <w:vAlign w:val="center"/>
+          </w:tcPr>
+          <w:p>
+            <w:pPr>
+              <w:spacing w:after="0"/>
+            </w:pPr>
+            <w:r>
+              <w:rPr>
+                <w:rFonts w:ascii="Calibri" w:cs="Calibri" w:eastAsia="Calibri" w:hAnsi="Calibri"/>
+                <w:b/>
+                <w:bCs/>
+                <w:color w:val="232323"/>
+                <w:sz w:val="21"/>
+                <w:szCs w:val="21"/>
+              </w:rPr>
+              <w:t xml:space="preserve">15 min</w:t>
+            </w:r>
+          </w:p>
+        </w:tc>
+        <w:tc>
+          <w:tcPr>
+            <w:tcW w:type="dxa" w:w="2200"/>
+            <w:tcMar>
+              <w:top w:type="dxa" w:w="70"/>
+              <w:left w:type="dxa" w:w="110"/>
+              <w:bottom w:type="dxa" w:w="70"/>
+              <w:right w:type="dxa" w:w="110"/>
+            </w:tcMar>
+            <w:vAlign w:val="center"/>
+          </w:tcPr>
+          <w:p>
+            <w:pPr>
+              <w:spacing w:after="0"/>
+            </w:pPr>
+            <w:r>
+              <w:rPr>
+                <w:rFonts w:ascii="Calibri" w:cs="Calibri" w:eastAsia="Calibri" w:hAnsi="Calibri"/>
+                <w:b w:val="false"/>
+                <w:bCs w:val="false"/>
+                <w:color w:val="232323"/>
+                <w:sz w:val="21"/>
+                <w:szCs w:val="21"/>
+              </w:rPr>
+              <w:t xml:space="preserve">Kahoot</w:t>
+            </w:r>
+          </w:p>
+        </w:tc>
+        <w:tc>
+          <w:tcPr>
+            <w:tcW w:type="dxa" w:w="900"/>
+            <w:tcMar>
+              <w:top w:type="dxa" w:w="70"/>
+              <w:left w:type="dxa" w:w="110"/>
+              <w:bottom w:type="dxa" w:w="70"/>
+              <w:right w:type="dxa" w:w="110"/>
+            </w:tcMar>
+            <w:vAlign w:val="center"/>
+          </w:tcPr>
+          <w:p>
+            <w:pPr>
+              <w:spacing w:after="0"/>
+            </w:pPr>
+            <w:r>
+              <w:rPr>
+                <w:rFonts w:ascii="Calibri" w:cs="Calibri" w:eastAsia="Calibri" w:hAnsi="Calibri"/>
+                <w:b w:val="false"/>
+                <w:bCs w:val="false"/>
+                <w:color w:val="232323"/>
+                <w:sz w:val="21"/>
+                <w:szCs w:val="21"/>
+              </w:rPr>
+              <w:t xml:space="preserve">29</w:t>
+            </w:r>
+          </w:p>
+        </w:tc>
+        <w:tc>
+          <w:tcPr>
+            <w:tcW w:type="dxa" w:w="5538"/>
+            <w:tcMar>
+              <w:top w:type="dxa" w:w="70"/>
+              <w:left w:type="dxa" w:w="110"/>
+              <w:bottom w:type="dxa" w:w="70"/>
+              <w:right w:type="dxa" w:w="110"/>
+            </w:tcMar>
+            <w:vAlign w:val="center"/>
+          </w:tcPr>
+          <w:p>
+            <w:pPr>
+              <w:spacing w:after="0"/>
+            </w:pPr>
+            <w:r>
+              <w:rPr>
+                <w:rFonts w:ascii="Calibri" w:cs="Calibri" w:eastAsia="Calibri" w:hAnsi="Calibri"/>
+                <w:b w:val="false"/>
+                <w:bCs w:val="false"/>
+                <w:color w:val="232323"/>
+                <w:sz w:val="21"/>
+                <w:szCs w:val="21"/>
+              </w:rPr>
+              <w:t xml:space="preserve">Quiz final com 22 perguntas (sozinho ou em dupla). Comentar a resposta certa depois de cada pergunta.</w:t>
+            </w:r>
+          </w:p>
+        </w:tc>
+      </w:tr>
+      <w:tr>
+        <w:trPr>
+          <w:cantSplit/>
+          <w:tblHeader w:val="false"/>
+        </w:trPr>
+        <w:tc>
+          <w:tcPr>
+            <w:tcW w:type="dxa" w:w="1000"/>
+            <w:shd w:fill="F5FAF3" w:color="auto" w:val="clear"/>
+            <w:tcMar>
+              <w:top w:type="dxa" w:w="70"/>
+              <w:left w:type="dxa" w:w="110"/>
+              <w:bottom w:type="dxa" w:w="70"/>
+              <w:right w:type="dxa" w:w="110"/>
+            </w:tcMar>
+            <w:vAlign w:val="center"/>
+          </w:tcPr>
+          <w:p>
+            <w:pPr>
+              <w:spacing w:after="0"/>
+            </w:pPr>
+            <w:r>
+              <w:rPr>
+                <w:rFonts w:ascii="Calibri" w:cs="Calibri" w:eastAsia="Calibri" w:hAnsi="Calibri"/>
+                <w:b/>
+                <w:bCs/>
+                <w:color w:val="232323"/>
+                <w:sz w:val="21"/>
+                <w:szCs w:val="21"/>
+              </w:rPr>
+              <w:t xml:space="preserve">5 min</w:t>
+            </w:r>
+          </w:p>
+        </w:tc>
+        <w:tc>
+          <w:tcPr>
+            <w:tcW w:type="dxa" w:w="2200"/>
+            <w:shd w:fill="F5FAF3" w:color="auto" w:val="clear"/>
+            <w:tcMar>
+              <w:top w:type="dxa" w:w="70"/>
+              <w:left w:type="dxa" w:w="110"/>
+              <w:bottom w:type="dxa" w:w="70"/>
+              <w:right w:type="dxa" w:w="110"/>
+            </w:tcMar>
+            <w:vAlign w:val="center"/>
+          </w:tcPr>
+          <w:p>
+            <w:pPr>
+              <w:spacing w:after="0"/>
+            </w:pPr>
+            <w:r>
+              <w:rPr>
+                <w:rFonts w:ascii="Calibri" w:cs="Calibri" w:eastAsia="Calibri" w:hAnsi="Calibri"/>
+                <w:b w:val="false"/>
+                <w:bCs w:val="false"/>
+                <w:color w:val="232323"/>
+                <w:sz w:val="21"/>
+                <w:szCs w:val="21"/>
+              </w:rPr>
+              <w:t xml:space="preserve">Fechamento</w:t>
+            </w:r>
+          </w:p>
+        </w:tc>
+        <w:tc>
+          <w:tcPr>
+            <w:tcW w:type="dxa" w:w="900"/>
+            <w:shd w:fill="F5FAF3" w:color="auto" w:val="clear"/>
+            <w:tcMar>
+              <w:top w:type="dxa" w:w="70"/>
+              <w:left w:type="dxa" w:w="110"/>
+              <w:bottom w:type="dxa" w:w="70"/>
+              <w:right w:type="dxa" w:w="110"/>
+            </w:tcMar>
+            <w:vAlign w:val="center"/>
+          </w:tcPr>
+          <w:p>
+            <w:pPr>
+              <w:spacing w:after="0"/>
+            </w:pPr>
+            <w:r>
+              <w:rPr>
+                <w:rFonts w:ascii="Calibri" w:cs="Calibri" w:eastAsia="Calibri" w:hAnsi="Calibri"/>
+                <w:b w:val="false"/>
+                <w:bCs w:val="false"/>
+                <w:color w:val="232323"/>
+                <w:sz w:val="21"/>
+                <w:szCs w:val="21"/>
+              </w:rPr>
+              <w:t xml:space="preserve">30</w:t>
+            </w:r>
+          </w:p>
+        </w:tc>
+        <w:tc>
+          <w:tcPr>
+            <w:tcW w:type="dxa" w:w="5538"/>
+            <w:shd w:fill="F5FAF3" w:color="auto" w:val="clear"/>
+            <w:tcMar>
+              <w:top w:type="dxa" w:w="70"/>
+              <w:left w:type="dxa" w:w="110"/>
+              <w:bottom w:type="dxa" w:w="70"/>
+              <w:right w:type="dxa" w:w="110"/>
+            </w:tcMar>
+            <w:vAlign w:val="center"/>
+          </w:tcPr>
+          <w:p>
+            <w:pPr>
+              <w:spacing w:after="0"/>
+            </w:pPr>
+            <w:r>
+              <w:rPr>
+                <w:rFonts w:ascii="Calibri" w:cs="Calibri" w:eastAsia="Calibri" w:hAnsi="Calibri"/>
+                <w:b w:val="false"/>
+                <w:bCs w:val="false"/>
+                <w:color w:val="232323"/>
+                <w:sz w:val="21"/>
+                <w:szCs w:val="21"/>
+              </w:rPr>
+              <w:t xml:space="preserve">Dúvidas e tarefa para casa.</w:t>
             </w:r>
           </w:p>
         </w:tc>
@@ -2124,7 +2383,7 @@
           <w:sz w:val="23"/>
           <w:szCs w:val="23"/>
         </w:rPr>
-        <w:t xml:space="preserve">1º encontro até o slide 20 (Atividades 1 a 5); 2º encontro do slide 21 ao fim (Atividades 6 a 9).</w:t>
+        <w:t xml:space="preserve">1º encontro até o slide 20 (Atividades 1 a 5); 2º encontro do slide 21 ao fim (Atividades 6 a 9 e Kahoot).</w:t>
       </w:r>
     </w:p>
     <w:p>
@@ -2214,6 +2473,25 @@
           <w:szCs w:val="23"/>
         </w:rPr>
         <w:t xml:space="preserve">justificativa da escolha do plano de internet na Atividade 9;</w:t>
+      </w:r>
+    </w:p>
+    <w:p>
+      <w:pPr>
+        <w:pStyle w:val="ListParagraph"/>
+        <w:numPr>
+          <w:ilvl w:val="0"/>
+          <w:numId w:val="2"/>
+        </w:numPr>
+        <w:spacing w:after="60" w:line="276"/>
+      </w:pPr>
+      <w:r>
+        <w:rPr>
+          <w:rFonts w:ascii="Calibri" w:cs="Calibri" w:eastAsia="Calibri" w:hAnsi="Calibri"/>
+          <w:color w:val="232323"/>
+          <w:sz w:val="23"/>
+          <w:szCs w:val="23"/>
+        </w:rPr>
+        <w:t xml:space="preserve">desempenho no quiz do Kahoot (relatório do Kahoot mostra as perguntas com mais erros, para retomar na aula seguinte);</w:t>
       </w:r>
     </w:p>
     <w:p>

</xml_diff>

<commit_message>
Adiciona fotos reais dos equipamentos à aula de Redes (EJA)
Cinco slides novos com fotos livres do Wikimedia Commons (peças da rede,
ADSL, fibra, rede móvel e satélite), com créditos; plano de aula renumerado.

Co-Authored-By: Claude Opus 5.5 <noreply@anthropic.com>
Claude-Session: https://claude.ai/code/session_01FwqaHkVbAJG16jSYb6wSMT
</commit_message>
<xml_diff>
--- a/aulas/eja-redes/Plano_de_Aula_Redes_EJA.docx
+++ b/aulas/eja-redes/Plano_de_Aula_Redes_EJA.docx
@@ -904,7 +904,7 @@
           <w:sz w:val="23"/>
           <w:szCs w:val="23"/>
         </w:rPr>
-        <w:t xml:space="preserve">Projetor e apresentação "Aula_021_Redes_de_Computadores_EJA.pptx" (30 slides, com roteiro nas anotações)</w:t>
+        <w:t xml:space="preserve">Projetor e apresentação "Aula_021_Redes_de_Computadores_EJA.pptx" (35 slides, com fotos reais dos equipamentos e roteiro nas anotações)</w:t>
       </w:r>
     </w:p>
     <w:p>
@@ -1366,7 +1366,7 @@
                 <w:sz w:val="21"/>
                 <w:szCs w:val="21"/>
               </w:rPr>
-              <w:t xml:space="preserve">6–8</w:t>
+              <w:t xml:space="preserve">6–9</w:t>
             </w:r>
           </w:p>
         </w:tc>
@@ -1395,7 +1395,7 @@
                 <w:sz w:val="21"/>
                 <w:szCs w:val="21"/>
               </w:rPr>
-              <w:t xml:space="preserve">Apresentar as peças da rede mostrando objetos reais. Folha — Atividade 1 (caça aos elementos, em duplas).</w:t>
+              <w:t xml:space="preserve">Apresentar as peças da rede com as fotos reais (slide 8) e os objetos do laboratório. Folha — Atividade 1 (caça aos elementos, em duplas).</w:t>
             </w:r>
           </w:p>
         </w:tc>
@@ -1485,7 +1485,7 @@
                 <w:sz w:val="21"/>
                 <w:szCs w:val="21"/>
               </w:rPr>
-              <w:t xml:space="preserve">9–11</w:t>
+              <w:t xml:space="preserve">10–12</w:t>
             </w:r>
           </w:p>
         </w:tc>
@@ -1606,7 +1606,7 @@
                 <w:sz w:val="21"/>
                 <w:szCs w:val="21"/>
               </w:rPr>
-              <w:t xml:space="preserve">12–20</w:t>
+              <w:t xml:space="preserve">13–25</w:t>
             </w:r>
           </w:p>
         </w:tc>
@@ -1635,7 +1635,7 @@
                 <w:sz w:val="21"/>
                 <w:szCs w:val="21"/>
               </w:rPr>
-              <w:t xml:space="preserve">Rede local, ADSL, fibra, 3G/4G/5G e satélite; tabela comparativa; charadas "Quem sou eu?"; cuidados de segurança. Folha — Atividades 3, 4 e 5.</w:t>
+              <w:t xml:space="preserve">Rede local, ADSL, fibra, 3G/4G/5G e satélite, cada um com um slide de fotos "na vida real"; tabela comparativa; charadas "Quem sou eu?"; cuidados de segurança. Folha — Atividades 3, 4 e 5.</w:t>
             </w:r>
           </w:p>
         </w:tc>
@@ -1725,7 +1725,7 @@
                 <w:sz w:val="21"/>
                 <w:szCs w:val="21"/>
               </w:rPr>
-              <w:t xml:space="preserve">21–25</w:t>
+              <w:t xml:space="preserve">26–30</w:t>
             </w:r>
           </w:p>
         </w:tc>
@@ -1846,7 +1846,7 @@
                 <w:sz w:val="21"/>
                 <w:szCs w:val="21"/>
               </w:rPr>
-              <w:t xml:space="preserve">26</w:t>
+              <w:t xml:space="preserve">31</w:t>
             </w:r>
           </w:p>
         </w:tc>
@@ -1965,7 +1965,7 @@
                 <w:sz w:val="21"/>
                 <w:szCs w:val="21"/>
               </w:rPr>
-              <w:t xml:space="preserve">27</w:t>
+              <w:t xml:space="preserve">32</w:t>
             </w:r>
           </w:p>
         </w:tc>
@@ -2086,7 +2086,7 @@
                 <w:sz w:val="21"/>
                 <w:szCs w:val="21"/>
               </w:rPr>
-              <w:t xml:space="preserve">28</w:t>
+              <w:t xml:space="preserve">33</w:t>
             </w:r>
           </w:p>
         </w:tc>
@@ -2205,7 +2205,7 @@
                 <w:sz w:val="21"/>
                 <w:szCs w:val="21"/>
               </w:rPr>
-              <w:t xml:space="preserve">29</w:t>
+              <w:t xml:space="preserve">34</w:t>
             </w:r>
           </w:p>
         </w:tc>
@@ -2326,7 +2326,7 @@
                 <w:sz w:val="21"/>
                 <w:szCs w:val="21"/>
               </w:rPr>
-              <w:t xml:space="preserve">30</w:t>
+              <w:t xml:space="preserve">35</w:t>
             </w:r>
           </w:p>
         </w:tc>
@@ -2383,7 +2383,7 @@
           <w:sz w:val="23"/>
           <w:szCs w:val="23"/>
         </w:rPr>
-        <w:t xml:space="preserve">1º encontro até o slide 20 (Atividades 1 a 5); 2º encontro do slide 21 ao fim (Atividades 6 a 9 e Kahoot).</w:t>
+        <w:t xml:space="preserve">1º encontro até o slide 25 (Atividades 1 a 5); 2º encontro do slide 26 ao fim (Atividades 6 a 9 e Kahoot).</w:t>
       </w:r>
     </w:p>
     <w:p>

</xml_diff>